<commit_message>
NSFR 4 variant: 1-jadval manbasi aniqlashtirildi
Co-Authored-By: Claude Opus 5.5 <noreply@anthropic.com>
Claude-Session: https://claude.ai/code/session_01PxHTC8Q7yHdrpAeUA5KUgM
</commit_message>
<xml_diff>
--- a/paragraflar/NSFR_4_variant.docx
+++ b/paragraflar/NSFR_4_variant.docx
@@ -940,7 +940,7 @@
           <w:rFonts w:ascii="Times New Roman" w:hAnsi="Times New Roman" w:cs="Times New Roman" w:eastAsia="Times New Roman"/>
           <w:sz w:val="28"/>
         </w:rPr>
-        <w:t xml:space="preserve">Ikki metodika o‘rtasidagi farqlar 1-jadvalda batafsil keltirildi.</w:t>
+        <w:t xml:space="preserve">Ikki metodika o‘rtasidagi farqlar 1-jadvalda batafsil keltirildi. Jadvaldagi Markaziy bank koeffitsiyentlari bankning 2025-yil 30-dekabr holatidagi rasmiy likvidlik tahlili shaklidan, Bazel III koeffitsiyentlari esa Bazel qo‘mitasining 2014-yilda qabul qilingan va hozirgacha amalda bo‘lgan standartidan olindi.</w:t>
       </w:r>
     </w:p>
     <w:p>
@@ -1735,7 +1735,7 @@
                 <w:rFonts w:ascii="Times New Roman" w:hAnsi="Times New Roman" w:cs="Times New Roman" w:eastAsia="Times New Roman"/>
                 <w:sz w:val="22"/>
               </w:rPr>
-              <w:t xml:space="preserve">30%</w:t>
+              <w:t xml:space="preserve">30% (yuqori likvid qismi – 0%)</w:t>
             </w:r>
           </w:p>
         </w:tc>

</xml_diff>

<commit_message>
NSFR 4 variant: 2709-son nizom matni bilan solishtirildi
Co-Authored-By: Claude Opus 5.5 <noreply@anthropic.com>
Claude-Session: https://claude.ai/code/session_01PxHTC8Q7yHdrpAeUA5KUgM
</commit_message>
<xml_diff>
--- a/paragraflar/NSFR_4_variant.docx
+++ b/paragraflar/NSFR_4_variant.docx
@@ -2,7 +2,7 @@
 <file path=word/document.xml><?xml version="1.0" encoding="utf-8"?>
 <w:document xmlns:w="http://schemas.openxmlformats.org/wordprocessingml/2006/main" xmlns:m="http://schemas.openxmlformats.org/officeDocument/2006/math" xmlns:r="http://schemas.openxmlformats.org/officeDocument/2006/relationships" xmlns:o="urn:schemas-microsoft-com:office:office" xmlns:v="urn:schemas-microsoft-com:vml" xmlns:w10="urn:schemas-microsoft-com:office:word" xmlns:a="http://schemas.openxmlformats.org/drawingml/2006/main" xmlns:pic="http://schemas.openxmlformats.org/drawingml/2006/picture" xmlns:wp="http://schemas.openxmlformats.org/drawingml/2006/wordprocessingDrawing">
   <w:body>
-    <w:bookmarkStart w:id="30" w:name="Xf2981250d5bc14211cc0a79b165d0f3c0c95708"/>
+    <w:bookmarkStart w:id="31" w:name="Xf2981250d5bc14211cc0a79b165d0f3c0c95708"/>
     <w:p>
       <w:pPr>
         <w:pStyle w:val="Heading2"/>
@@ -1139,7 +1139,7 @@
                 <w:rFonts w:ascii="Times New Roman" w:hAnsi="Times New Roman" w:cs="Times New Roman" w:eastAsia="Times New Roman"/>
                 <w:sz w:val="22"/>
               </w:rPr>
-              <w:t xml:space="preserve">Kapital</w:t>
+              <w:t xml:space="preserve">Kapital (nizomda – regulyativ kapital, bank shaklida – xususiy kapital)</w:t>
             </w:r>
           </w:p>
         </w:tc>
@@ -1511,7 +1511,7 @@
                 <w:rFonts w:ascii="Times New Roman" w:hAnsi="Times New Roman" w:cs="Times New Roman" w:eastAsia="Times New Roman"/>
                 <w:sz w:val="22"/>
               </w:rPr>
-              <w:t xml:space="preserve">30%</w:t>
+              <w:t xml:space="preserve">30% (nizomda – faqat depozit va qarz mablag‘lari)</w:t>
             </w:r>
           </w:p>
         </w:tc>
@@ -2066,6 +2066,34 @@
           <w:rFonts w:ascii="Times New Roman" w:hAnsi="Times New Roman" w:cs="Times New Roman" w:eastAsia="Times New Roman"/>
           <w:sz w:val="28"/>
         </w:rPr>
+        <w:t xml:space="preserve">Markaziy bank koeffitsiyentlari nizomning 53–55-bandlari va 2-ilovasidagi hisoblash namunasi bilan solishtirildi</w:t>
+      </w:r>
+      <w:r>
+        <w:rPr>
+          <w:rStyle w:val="FootnoteReference"/>
+        </w:rPr>
+        <w:footnoteReference w:id="28"/>
+      </w:r>
+      <w:r>
+        <w:rPr>
+          <w:rFonts w:ascii="Times New Roman" w:hAnsi="Times New Roman" w:cs="Times New Roman" w:eastAsia="Times New Roman"/>
+          <w:sz w:val="28"/>
+        </w:rPr>
+        <w:t xml:space="preserve">. Koeffitsiyentlar to‘liq mos keladi, biroq ikki jihatda nizom matni va bankning hisobot shakli o‘rtasida farq aniqlandi. Birinchidan, nizomda mavjud barqaror moliyalashtirish tarkibiga bankning regulyativ kapitali kiritilishi belgilangan, bankning hisobot shaklida esa xususiy kapital ko‘rsatilgan. «O‘zsanoatqurilishbank» ATB da regulyativ kapital (16 199,1 mlrd so‘m) xususiy kapitaldan (11 875,2 mlrd so‘m) ancha katta bo‘lgani uchun, nizom matni bo‘yicha hisoblanganda me’yor 122,2 foiz emas, taxminan 129,4 foizni tashkil etadi. Ikkinchidan, nizomda 30 foiz koeffitsiyent faqat depozitlar va qarz mablag‘lariga qo‘llanadi, hisobot shaklida esa bir yilgacha bo‘lgan barcha majburiyatlarga qo‘llangan. Ikkala holatda ham bankning amaldagi hisobot shakli nizomning 2015-yilgi matniga nisbatan ehtiyotkorroq natija beradi. Bu farqlar keyingi o‘zgartirishlar bilan bog‘liq bo‘lishi mumkin, shu sababli ularni nizomning amaldagi tahriri bilan tekshirish lozim.</w:t>
+      </w:r>
+    </w:p>
+    <w:p>
+      <w:pPr>
+        <w:pStyle w:val="BodyText"/>
+        <w:spacing w:line="360" w:lineRule="auto" w:before="0" w:after="0"/>
+        <w:ind w:firstLine="709"/>
+        <w:jc w:val="both"/>
+      </w:pPr>
+      <w:r>
+        <w:rPr>
+          <w:rFonts w:ascii="Times New Roman" w:hAnsi="Times New Roman" w:cs="Times New Roman" w:eastAsia="Times New Roman"/>
+          <w:sz w:val="28"/>
+        </w:rPr>
         <w:t xml:space="preserve">Jadval ma’lumotlari shuni ko‘rsatadiki, ikki metodika o‘rtasidagi asosiy farq kontragent turini hisobga olishda. Markaziy bank metodikasi qisqa muddatli resurslarni kim tomonidan joylashtirilganiga qaramay bir xil 30 foiz koeffitsiyent bilan baholaydi. Bazel III da esa jismoniy shaxslar depozitlari eng barqaror resurs sifatida 90–95 foiz, moliya institutlarining qisqa muddatli resurslari esa eng beqaror resurs sifatida 0 foiz koeffitsiyent oladi. Natijada depozit bazasi aholi va korxonalar mablag‘laridan iborat bank uchun milliy metodika me’yorni kamsitib, ulgurji bozordan qisqa muddatli resurs jalb qiluvchi bank uchun esa oshirib ko‘rsatadi. Aktivlar tomonida esa milliy metodika ba’zi jihatdan Bazel III dan qat’iyroq: muddati bir yildan ortiq davlat qimmatli qog‘ozlari unda 100 foiz, Bazel III da esa yuqori likvid aktiv sifatida atigi 5 foiz koeffitsiyent bilan olinadi.</w:t>
       </w:r>
     </w:p>
@@ -2122,7 +2150,7 @@
         <w:rPr>
           <w:rStyle w:val="FootnoteReference"/>
         </w:rPr>
-        <w:footnoteReference w:id="28"/>
+        <w:footnoteReference w:id="29"/>
       </w:r>
     </w:p>
     <w:tbl>
@@ -3396,7 +3424,7 @@
         <w:rPr>
           <w:rStyle w:val="FootnoteReference"/>
         </w:rPr>
-        <w:footnoteReference w:id="29"/>
+        <w:footnoteReference w:id="30"/>
       </w:r>
     </w:p>
     <w:p>
@@ -3429,7 +3457,7 @@
         <w:t xml:space="preserve">Hisob-kitobning cheklovlarini ham qayd etish lozim. Milliy hisobot alohida bank bo‘yicha 2025-yil 30-dekabr holatiga, MHXS hisoboti esa bank guruhi bo‘yicha 31-dekabr holatiga tuzilgan. Bazel III metodikasida jismoniy shaxslar depozitlarining barqaror va kamroq barqaror qismlarini ajratish uchun ma’lumot yo‘qligi sababli ularga ehtiyotkorlik bilan 90 foiz koeffitsiyent qo‘llandi, MHXS tuzatishlari esa eng muhim uch omil bo‘yicha taxminiy tarzda kiritildi. Shunga qaramay, olingan natijalar farqlarning yo‘nalishi va ko‘lamini ishonchli tarzda ko‘rsatadi.</w:t>
       </w:r>
     </w:p>
-    <w:bookmarkEnd w:id="30"/>
+    <w:bookmarkEnd w:id="31"/>
     <w:sectPr>
       <w:pgMar w:left="1701" w:right="850" w:top="1134" w:bottom="1134"/>
     </w:sectPr>
@@ -3624,11 +3652,30 @@
         <w:t xml:space="preserve"> </w:t>
       </w:r>
       <w:r>
-        <w:t xml:space="preserve">Tadqiqot natijasida muallif tomonidan quyidagi manbalar ma’lumotlari asosida hisoblandi: «O‘zsanoatqurilishbank» ATB ning 2025-yil 30-dekabr holatidagi prudensial hisobot shakllari (1, 10, 16–18-jadvallar); Joint Stock Commercial Bank «Uzbek Industrial and Construction Bank» and its subsidiaries. Consolidated Financial Statements for the year ended 31 December 2025. – Tashkent, 2026. – P. 2–3, 28–31.</w:t>
+        <w:t xml:space="preserve">O‘zbekiston Respublikasi Markaziy banki Boshqaruvining 2015-yil 22-iyuldagi 19/14-son qarori bilan tasdiqlangan «Tijorat banklarining likvidliligini boshqarishga qo‘yiladigan talablar to‘g‘risida»gi nizom (ro‘yxat raqami 2709). – 53–55-bandlar, 2-ilova // O‘zbekiston Respublikasi qonun hujjatlari to‘plami. – 2015. – 32 (688)-son. – 437-modda.</w:t>
       </w:r>
     </w:p>
   </w:footnote>
   <w:footnote w:id="29">
+    <w:p>
+      <w:pPr>
+        <w:pStyle w:val="FootnoteText"/>
+      </w:pPr>
+      <w:r>
+        <w:rPr>
+          <w:rStyle w:val="FootnoteReference"/>
+        </w:rPr>
+        <w:footnoteRef/>
+      </w:r>
+      <w:r>
+        <w:t xml:space="preserve"> </w:t>
+      </w:r>
+      <w:r>
+        <w:t xml:space="preserve">Tadqiqot natijasida muallif tomonidan quyidagi manbalar ma’lumotlari asosida hisoblandi: «O‘zsanoatqurilishbank» ATB ning 2025-yil 30-dekabr holatidagi prudensial hisobot shakllari (1, 10, 16–18-jadvallar); Joint Stock Commercial Bank «Uzbek Industrial and Construction Bank» and its subsidiaries. Consolidated Financial Statements for the year ended 31 December 2025. – Tashkent, 2026. – P. 2–3, 28–31.</w:t>
+      </w:r>
+    </w:p>
+  </w:footnote>
+  <w:footnote w:id="30">
     <w:p>
       <w:pPr>
         <w:pStyle w:val="FootnoteText"/>

</xml_diff>